<commit_message>
fix(modeles): B1 / B2 jetonnes sur les champs des travaux (B05-GQ-03, B04-OV-02, DERIVE.validite-garantie) ; clause de remise electronique sans B05-GS-10
Co-Authored-By: Claude Opus 5.5 (1M context) <noreply@anthropic.com>
</commit_message>
<xml_diff>
--- a/docs/modeles-candidat/armp/B1.docx
+++ b/docs/modeles-candidat/armp/B1.docx
@@ -38,7 +38,7 @@
           <w:b w:val="off"/>
           <w:sz w:val="22"/>
         </w:rPr>
-        <w:t>EN CONSEQUENCE, Nous, [nom de la banque], ayant notre siège à [adresse du siège] (ci-après dénommée “le Garant”), avons accepté de nous porter garant du Candidat pour la somme de {{B05-GS-03.lettres}} ({{B05-GS-03.chiffres}} Ariary), que nous nous engageons à régler intégralement à l’Autorité Contractante dans les conditions suivantes :</w:t>
+        <w:t>EN CONSEQUENCE, Nous, [nom de la banque], ayant notre siège à [adresse du siège] (ci-après dénommée “le Garant”), avons accepté de nous porter garant du Candidat pour la somme de {{B05-GQ-03.lettres}} ({{B05-GQ-03.chiffres}} Ariary), que nous nous engageons à régler intégralement à l’Autorité Contractante dans les conditions suivantes :</w:t>
       </w:r>
     </w:p>
     <w:p>
@@ -129,7 +129,7 @@
           <w:b w:val="off"/>
           <w:sz w:val="22"/>
         </w:rPr>
-        <w:t>La présente garantie demeurera valable jusqu’au trentième (30ème) jour suivant l’expiration de la période de validité des offres, soit jusqu’au {{B05-GS-04}} ème jour à compter de la date limite fixée pour la remise des offres. Cette date peut être reportée par l'Autorité Contractante par notification écrite au Candidat et au Garant. Toute demande relative à cette garantie devra parvenir au Garant au plus tard à la date d’expiration faute de quoi la présente garantie expire de plein droit.</w:t>
+        <w:t>La présente garantie demeurera valable jusqu’au trentième (30ème) jour suivant l’expiration de la période de validité des offres, soit jusqu’au {{DERIVE.validite-garantie}} ème jour à compter de la date limite fixée pour la remise des offres. Cette date peut être reportée par l'Autorité Contractante par notification écrite au Candidat et au Garant. Toute demande relative à cette garantie devra parvenir au Garant au plus tard à la date d’expiration faute de quoi la présente garantie expire de plein droit.</w:t>
       </w:r>
     </w:p>
     <w:p>
@@ -155,7 +155,7 @@
           <w:b w:val="off"/>
           <w:sz w:val="22"/>
         </w:rPr>
-        <w:t>[[CLAUSE À FOURNIR PAR LE JURISTE : remise électronique — voie de remise de la garantie ({{B05-GS-10}}) et code de vérification]]</w:t>
+        <w:t>[[CLAUSE À FOURNIR PAR LE JURISTE : remise électronique — voie de remise de la garantie et code de vérification]]</w:t>
       </w:r>
     </w:p>
     <w:p>

</xml_diff>